<commit_message>
another commit with what should be all the Rmd's
</commit_message>
<xml_diff>
--- a/figs/beta_table.docx
+++ b/figs/beta_table.docx
@@ -480,7 +480,7 @@
                 <w:szCs w:val="22"/>
                 <w:color w:val="000000"/>
               </w:rPr>
-              <w:t xml:space="preserve">0.00</w:t>
+              <w:t xml:space="preserve">0.0</w:t>
             </w:r>
           </w:p>
         </w:tc>
@@ -702,7 +702,7 @@
                 <w:szCs w:val="22"/>
                 <w:color w:val="000000"/>
               </w:rPr>
-              <w:t xml:space="preserve">3.29</w:t>
+              <w:t xml:space="preserve">3.3</w:t>
             </w:r>
           </w:p>
         </w:tc>

</xml_diff>